<commit_message>
Add: big inserimento di documenti di testing
Mod: modificato anche testplan og
</commit_message>
<xml_diff>
--- a/Workspace/Testing/Test plan/punti singoli/TestPlan unit testing/Testplan - ProfileManagementService.docx
+++ b/Workspace/Testing/Test plan/punti singoli/TestPlan unit testing/Testplan - ProfileManagementService.docx
@@ -2795,11 +2795,14 @@
       </w:tr>
     </w:tbl>
     <w:p/>
+    <w:p/>
+    <w:p/>
     <w:p>
       <w:pPr>
         <w:pStyle w:val="Titolo4"/>
       </w:pPr>
       <w:r>
+        <w:lastRenderedPageBreak/>
         <w:t>Test frames</w:t>
       </w:r>
     </w:p>
@@ -2831,7 +2834,6 @@
                 <w:b/>
                 <w:bCs/>
               </w:rPr>
-              <w:lastRenderedPageBreak/>
               <w:t>ID Frame</w:t>
             </w:r>
           </w:p>
@@ -4508,6 +4510,7 @@
   <w:style w:type="character" w:default="1" w:styleId="Carpredefinitoparagrafo">
     <w:name w:val="Default Paragraph Font"/>
     <w:uiPriority w:val="1"/>
+    <w:semiHidden/>
     <w:unhideWhenUsed/>
   </w:style>
   <w:style w:type="table" w:default="1" w:styleId="Tabellanormale">

</xml_diff>